<commit_message>
Update cell explorer website
</commit_message>
<xml_diff>
--- a/说明文档-readme.docx
+++ b/说明文档-readme.docx
@@ -71,37 +71,86 @@
           <w:rFonts w:ascii="宋体" w:eastAsia="宋体" w:hAnsi="宋体" w:hint="eastAsia"/>
           <w:sz w:val="24"/>
         </w:rPr>
-        <w:t>首次进入：微缩工厂运转 → 建筑原位变形 → 细胞器显现 → 接入主页。</w:t>
-      </w:r>
-    </w:p>
-    <w:p>
-      <w:pPr>
-        <w:rPr>
-          <w:rFonts w:ascii="宋体" w:eastAsia="宋体" w:hAnsi="宋体" w:hint="eastAsia"/>
-          <w:sz w:val="24"/>
-        </w:rPr>
-      </w:pPr>
-      <w:r>
-        <w:rPr>
-          <w:rFonts w:ascii="宋体" w:eastAsia="宋体" w:hAnsi="宋体" w:hint="eastAsia"/>
-          <w:sz w:val="24"/>
-        </w:rPr>
-        <w:t>开场约 12 秒，三句居中大字幕；控制中心、能源站、生产管网、分拣中心依次转换。</w:t>
-      </w:r>
-    </w:p>
-    <w:p>
-      <w:pPr>
-        <w:rPr>
-          <w:rFonts w:ascii="宋体" w:eastAsia="宋体" w:hAnsi="宋体" w:hint="eastAsia"/>
-          <w:sz w:val="24"/>
-        </w:rPr>
-      </w:pPr>
-      <w:r>
-        <w:rPr>
-          <w:rFonts w:ascii="宋体" w:eastAsia="宋体" w:hAnsi="宋体" w:hint="eastAsia"/>
-          <w:sz w:val="24"/>
-        </w:rPr>
-        <w:t>首页标题：一个细胞，一座生命工厂。</w:t>
+        <w:t>首次进入：微缩工厂</w:t>
+      </w:r>
+      <w:proofErr w:type="gramStart"/>
+      <w:r>
+        <w:rPr>
+          <w:rFonts w:ascii="宋体" w:eastAsia="宋体" w:hAnsi="宋体" w:hint="eastAsia"/>
+          <w:sz w:val="24"/>
+        </w:rPr>
+        <w:t xml:space="preserve">运转 → </w:t>
+      </w:r>
+      <w:proofErr w:type="gramEnd"/>
+      <w:r>
+        <w:rPr>
+          <w:rFonts w:ascii="宋体" w:eastAsia="宋体" w:hAnsi="宋体" w:hint="eastAsia"/>
+          <w:sz w:val="24"/>
+        </w:rPr>
+        <w:t>建筑原位</w:t>
+      </w:r>
+      <w:proofErr w:type="gramStart"/>
+      <w:r>
+        <w:rPr>
+          <w:rFonts w:ascii="宋体" w:eastAsia="宋体" w:hAnsi="宋体" w:hint="eastAsia"/>
+          <w:sz w:val="24"/>
+        </w:rPr>
+        <w:t xml:space="preserve">变形 → </w:t>
+      </w:r>
+      <w:proofErr w:type="gramEnd"/>
+      <w:r>
+        <w:rPr>
+          <w:rFonts w:ascii="宋体" w:eastAsia="宋体" w:hAnsi="宋体" w:hint="eastAsia"/>
+          <w:sz w:val="24"/>
+        </w:rPr>
+        <w:t>细胞器</w:t>
+      </w:r>
+      <w:proofErr w:type="gramStart"/>
+      <w:r>
+        <w:rPr>
+          <w:rFonts w:ascii="宋体" w:eastAsia="宋体" w:hAnsi="宋体" w:hint="eastAsia"/>
+          <w:sz w:val="24"/>
+        </w:rPr>
+        <w:t xml:space="preserve">显现 → </w:t>
+      </w:r>
+      <w:proofErr w:type="gramEnd"/>
+      <w:r>
+        <w:rPr>
+          <w:rFonts w:ascii="宋体" w:eastAsia="宋体" w:hAnsi="宋体" w:hint="eastAsia"/>
+          <w:sz w:val="24"/>
+        </w:rPr>
+        <w:t>接入主页。</w:t>
+      </w:r>
+    </w:p>
+    <w:p>
+      <w:pPr>
+        <w:rPr>
+          <w:rFonts w:ascii="宋体" w:eastAsia="宋体" w:hAnsi="宋体" w:hint="eastAsia"/>
+          <w:sz w:val="24"/>
+        </w:rPr>
+      </w:pPr>
+      <w:r>
+        <w:rPr>
+          <w:rFonts w:ascii="宋体" w:eastAsia="宋体" w:hAnsi="宋体" w:hint="eastAsia"/>
+          <w:sz w:val="24"/>
+        </w:rPr>
+        <w:t>开场</w:t>
+      </w:r>
+      <w:proofErr w:type="gramStart"/>
+      <w:r>
+        <w:rPr>
+          <w:rFonts w:ascii="宋体" w:eastAsia="宋体" w:hAnsi="宋体" w:hint="eastAsia"/>
+          <w:sz w:val="24"/>
+        </w:rPr>
+        <w:t xml:space="preserve">约 12 </w:t>
+      </w:r>
+      <w:proofErr w:type="gramEnd"/>
+      <w:r>
+        <w:rPr>
+          <w:rFonts w:ascii="宋体" w:eastAsia="宋体" w:hAnsi="宋体" w:hint="eastAsia"/>
+          <w:sz w:val="24"/>
+        </w:rPr>
+        <w:t>秒，三句居中大字幕；控制中心、能源站、生产管网、分拣中心依次转换。</w:t>
       </w:r>
     </w:p>
     <w:p>
@@ -131,7 +180,39 @@
           <w:rFonts w:ascii="宋体" w:eastAsia="宋体" w:hAnsi="宋体" w:hint="eastAsia"/>
           <w:sz w:val="24"/>
         </w:rPr>
-        <w:t>同一标签页返回主页不重复播放；index.html?intro=1 可强制播放。</w:t>
+        <w:t>同一标签页返回主页不重复播放；</w:t>
+      </w:r>
+      <w:proofErr w:type="spellStart"/>
+      <w:r>
+        <w:rPr>
+          <w:rFonts w:ascii="宋体" w:eastAsia="宋体" w:hAnsi="宋体" w:hint="eastAsia"/>
+          <w:sz w:val="24"/>
+        </w:rPr>
+        <w:t>index.html?intro</w:t>
+      </w:r>
+      <w:proofErr w:type="spellEnd"/>
+      <w:r>
+        <w:rPr>
+          <w:rFonts w:ascii="宋体" w:eastAsia="宋体" w:hAnsi="宋体" w:hint="eastAsia"/>
+          <w:sz w:val="24"/>
+        </w:rPr>
+        <w:t>=</w:t>
+      </w:r>
+      <w:proofErr w:type="gramStart"/>
+      <w:r>
+        <w:rPr>
+          <w:rFonts w:ascii="宋体" w:eastAsia="宋体" w:hAnsi="宋体" w:hint="eastAsia"/>
+          <w:sz w:val="24"/>
+        </w:rPr>
+        <w:t>1 可</w:t>
+      </w:r>
+      <w:proofErr w:type="gramEnd"/>
+      <w:r>
+        <w:rPr>
+          <w:rFonts w:ascii="宋体" w:eastAsia="宋体" w:hAnsi="宋体" w:hint="eastAsia"/>
+          <w:sz w:val="24"/>
+        </w:rPr>
+        <w:t>强制播放。</w:t>
       </w:r>
     </w:p>
     <w:p>
@@ -212,32 +293,10 @@
     <w:p>
       <w:pPr>
         <w:rPr>
-          <w:rFonts w:ascii="宋体" w:eastAsia="宋体" w:hAnsi="宋体" w:hint="eastAsia"/>
-          <w:sz w:val="24"/>
-        </w:rPr>
-      </w:pPr>
-      <w:r>
-        <w:rPr>
-          <w:rFonts w:ascii="宋体" w:eastAsia="宋体" w:hAnsi="宋体" w:hint="eastAsia"/>
-          <w:sz w:val="24"/>
-        </w:rPr>
-        <w:t>当前网站不使用拟真图片。模型是教学剖面示意，不是等比例显微或原子结构重建。</w:t>
-      </w:r>
-    </w:p>
-    <w:p>
-      <w:pPr>
-        <w:rPr>
-          <w:rFonts w:ascii="宋体" w:eastAsia="宋体" w:hAnsi="宋体" w:hint="eastAsia"/>
-          <w:sz w:val="24"/>
-        </w:rPr>
-      </w:pPr>
-      <w:r>
-        <w:rPr>
-          <w:rFonts w:ascii="宋体" w:eastAsia="宋体" w:hAnsi="宋体" w:hint="eastAsia"/>
-          <w:sz w:val="24"/>
-        </w:rPr>
-        <w:t>源码已统一分行和缩进，建模函数有中文注释。</w:t>
-      </w:r>
+          <w:rFonts w:ascii="宋体" w:eastAsia="宋体" w:hAnsi="宋体"/>
+          <w:sz w:val="24"/>
+        </w:rPr>
+      </w:pPr>
     </w:p>
     <w:p>
       <w:pPr>
@@ -257,7 +316,7 @@
     <w:p>
       <w:pPr>
         <w:rPr>
-          <w:rFonts w:ascii="宋体" w:eastAsia="宋体" w:hAnsi="宋体" w:hint="eastAsia"/>
+          <w:rFonts w:ascii="宋体" w:eastAsia="宋体" w:hAnsi="宋体"/>
           <w:sz w:val="24"/>
         </w:rPr>
       </w:pPr>
@@ -268,6 +327,43 @@
         </w:rPr>
         <w:t>第三方 vendor/three.min.js 保留官方压缩形式；许可见 vendor/THREE-LICENSE.txt。</w:t>
       </w:r>
+    </w:p>
+    <w:p>
+      <w:pPr>
+        <w:rPr>
+          <w:rFonts w:hint="eastAsia"/>
+        </w:rPr>
+      </w:pPr>
+      <w:proofErr w:type="spellStart"/>
+      <w:r>
+        <w:rPr>
+          <w:rFonts w:ascii="宋体" w:eastAsia="宋体" w:hAnsi="宋体" w:hint="eastAsia"/>
+          <w:sz w:val="24"/>
+        </w:rPr>
+        <w:t>Github</w:t>
+      </w:r>
+      <w:proofErr w:type="spellEnd"/>
+      <w:r>
+        <w:rPr>
+          <w:rFonts w:ascii="宋体" w:eastAsia="宋体" w:hAnsi="宋体" w:hint="eastAsia"/>
+          <w:sz w:val="24"/>
+        </w:rPr>
+        <w:t>:</w:t>
+      </w:r>
+      <w:r>
+        <w:rPr>
+          <w:rFonts w:hint="eastAsia"/>
+        </w:rPr>
+        <w:t xml:space="preserve"> </w:t>
+      </w:r>
+      <w:hyperlink r:id="rId6" w:history="1">
+        <w:r>
+          <w:rPr>
+            <w:rStyle w:val="af2"/>
+          </w:rPr>
+          <w:t>https://github.com/PerryPali/cell-explorer</w:t>
+        </w:r>
+      </w:hyperlink>
     </w:p>
     <w:sectPr>
       <w:pgSz w:w="11906" w:h="16838"/>
@@ -277,6 +373,68 @@
     </w:sectPr>
   </w:body>
 </w:document>
+</file>
+
+<file path=word/endnotes.xml><?xml version="1.0" encoding="utf-8"?>
+<w:endnotes xmlns:wpc="http://schemas.microsoft.com/office/word/2010/wordprocessingCanvas" xmlns:cx="http://schemas.microsoft.com/office/drawing/2014/chartex" xmlns:cx1="http://schemas.microsoft.com/office/drawing/2015/9/8/chartex" xmlns:cx2="http://schemas.microsoft.com/office/drawing/2015/10/21/chartex" xmlns:cx3="http://schemas.microsoft.com/office/drawing/2016/5/9/chartex" xmlns:cx4="http://schemas.microsoft.com/office/drawing/2016/5/10/chartex" xmlns:cx5="http://schemas.microsoft.com/office/drawing/2016/5/11/chartex" xmlns:cx6="http://schemas.microsoft.com/office/drawing/2016/5/12/chartex" xmlns:cx7="http://schemas.microsoft.com/office/drawing/2016/5/13/chartex" xmlns:cx8="http://schemas.microsoft.com/office/drawing/2016/5/14/chartex" xmlns:mc="http://schemas.openxmlformats.org/markup-compatibility/2006" xmlns:aink="http://schemas.microsoft.com/office/drawing/2016/ink" xmlns:am3d="http://schemas.microsoft.com/office/drawing/2017/model3d" xmlns:o="urn:schemas-microsoft-com:office:office" xmlns:oel="http://schemas.microsoft.com/office/2019/extlst" xmlns:r="http://schemas.openxmlformats.org/officeDocument/2006/relationships" xmlns:m="http://schemas.openxmlformats.org/officeDocument/2006/math" xmlns:v="urn:schemas-microsoft-com:vml" xmlns:wp14="http://schemas.microsoft.com/office/word/2010/wordprocessingDrawing" xmlns:wp="http://schemas.openxmlformats.org/drawingml/2006/wordprocessingDrawing" xmlns:w10="urn:schemas-microsoft-com:office:word" xmlns:w="http://schemas.openxmlformats.org/wordprocessingml/2006/main" xmlns:w14="http://schemas.microsoft.com/office/word/2010/wordml" xmlns:w15="http://schemas.microsoft.com/office/word/2012/wordml" xmlns:w16cex="http://schemas.microsoft.com/office/word/2018/wordml/cex" xmlns:w16cid="http://schemas.microsoft.com/office/word/2016/wordml/cid" xmlns:w16="http://schemas.microsoft.com/office/word/2018/wordml" xmlns:w16du="http://schemas.microsoft.com/office/word/2023/wordml/word16du" xmlns:w16sdtdh="http://schemas.microsoft.com/office/word/2020/wordml/sdtdatahash" xmlns:w16sdtfl="http://schemas.microsoft.com/office/word/2024/wordml/sdtformatlock" xmlns:w16se="http://schemas.microsoft.com/office/word/2015/wordml/symex" xmlns:wpg="http://schemas.microsoft.com/office/word/2010/wordprocessingGroup" xmlns:wpi="http://schemas.microsoft.com/office/word/2010/wordprocessingInk" xmlns:wne="http://schemas.microsoft.com/office/word/2006/wordml" xmlns:wps="http://schemas.microsoft.com/office/word/2010/wordprocessingShape" mc:Ignorable="w14 w15 w16se w16cid w16 w16cex w16sdtdh w16sdtfl w16du wp14">
+  <w:endnote w:type="separator" w:id="-1">
+    <w:p>
+      <w:pPr>
+        <w:spacing w:after="0" w:line="240" w:lineRule="auto"/>
+        <w:rPr>
+          <w:rFonts w:hint="eastAsia"/>
+        </w:rPr>
+      </w:pPr>
+      <w:r>
+        <w:separator/>
+      </w:r>
+    </w:p>
+  </w:endnote>
+  <w:endnote w:type="continuationSeparator" w:id="0">
+    <w:p>
+      <w:pPr>
+        <w:spacing w:after="0" w:line="240" w:lineRule="auto"/>
+        <w:rPr>
+          <w:rFonts w:hint="eastAsia"/>
+        </w:rPr>
+      </w:pPr>
+      <w:r>
+        <w:continuationSeparator/>
+      </w:r>
+    </w:p>
+  </w:endnote>
+</w:endnotes>
+</file>
+
+<file path=word/footnotes.xml><?xml version="1.0" encoding="utf-8"?>
+<w:footnotes xmlns:wpc="http://schemas.microsoft.com/office/word/2010/wordprocessingCanvas" xmlns:cx="http://schemas.microsoft.com/office/drawing/2014/chartex" xmlns:cx1="http://schemas.microsoft.com/office/drawing/2015/9/8/chartex" xmlns:cx2="http://schemas.microsoft.com/office/drawing/2015/10/21/chartex" xmlns:cx3="http://schemas.microsoft.com/office/drawing/2016/5/9/chartex" xmlns:cx4="http://schemas.microsoft.com/office/drawing/2016/5/10/chartex" xmlns:cx5="http://schemas.microsoft.com/office/drawing/2016/5/11/chartex" xmlns:cx6="http://schemas.microsoft.com/office/drawing/2016/5/12/chartex" xmlns:cx7="http://schemas.microsoft.com/office/drawing/2016/5/13/chartex" xmlns:cx8="http://schemas.microsoft.com/office/drawing/2016/5/14/chartex" xmlns:mc="http://schemas.openxmlformats.org/markup-compatibility/2006" xmlns:aink="http://schemas.microsoft.com/office/drawing/2016/ink" xmlns:am3d="http://schemas.microsoft.com/office/drawing/2017/model3d" xmlns:o="urn:schemas-microsoft-com:office:office" xmlns:oel="http://schemas.microsoft.com/office/2019/extlst" xmlns:r="http://schemas.openxmlformats.org/officeDocument/2006/relationships" xmlns:m="http://schemas.openxmlformats.org/officeDocument/2006/math" xmlns:v="urn:schemas-microsoft-com:vml" xmlns:wp14="http://schemas.microsoft.com/office/word/2010/wordprocessingDrawing" xmlns:wp="http://schemas.openxmlformats.org/drawingml/2006/wordprocessingDrawing" xmlns:w10="urn:schemas-microsoft-com:office:word" xmlns:w="http://schemas.openxmlformats.org/wordprocessingml/2006/main" xmlns:w14="http://schemas.microsoft.com/office/word/2010/wordml" xmlns:w15="http://schemas.microsoft.com/office/word/2012/wordml" xmlns:w16cex="http://schemas.microsoft.com/office/word/2018/wordml/cex" xmlns:w16cid="http://schemas.microsoft.com/office/word/2016/wordml/cid" xmlns:w16="http://schemas.microsoft.com/office/word/2018/wordml" xmlns:w16du="http://schemas.microsoft.com/office/word/2023/wordml/word16du" xmlns:w16sdtdh="http://schemas.microsoft.com/office/word/2020/wordml/sdtdatahash" xmlns:w16sdtfl="http://schemas.microsoft.com/office/word/2024/wordml/sdtformatlock" xmlns:w16se="http://schemas.microsoft.com/office/word/2015/wordml/symex" xmlns:wpg="http://schemas.microsoft.com/office/word/2010/wordprocessingGroup" xmlns:wpi="http://schemas.microsoft.com/office/word/2010/wordprocessingInk" xmlns:wne="http://schemas.microsoft.com/office/word/2006/wordml" xmlns:wps="http://schemas.microsoft.com/office/word/2010/wordprocessingShape" mc:Ignorable="w14 w15 w16se w16cid w16 w16cex w16sdtdh w16sdtfl w16du wp14">
+  <w:footnote w:type="separator" w:id="-1">
+    <w:p>
+      <w:pPr>
+        <w:spacing w:after="0" w:line="240" w:lineRule="auto"/>
+        <w:rPr>
+          <w:rFonts w:hint="eastAsia"/>
+        </w:rPr>
+      </w:pPr>
+      <w:r>
+        <w:separator/>
+      </w:r>
+    </w:p>
+  </w:footnote>
+  <w:footnote w:type="continuationSeparator" w:id="0">
+    <w:p>
+      <w:pPr>
+        <w:spacing w:after="0" w:line="240" w:lineRule="auto"/>
+        <w:rPr>
+          <w:rFonts w:hint="eastAsia"/>
+        </w:rPr>
+      </w:pPr>
+      <w:r>
+        <w:continuationSeparator/>
+      </w:r>
+    </w:p>
+  </w:footnote>
+</w:footnotes>
 </file>
 
 <file path=word/styles.xml><?xml version="1.0" encoding="utf-8"?>
@@ -1203,6 +1361,80 @@
       <w:spacing w:val="5"/>
     </w:rPr>
   </w:style>
+  <w:style w:type="paragraph" w:styleId="ae">
+    <w:name w:val="header"/>
+    <w:basedOn w:val="a"/>
+    <w:link w:val="af"/>
+    <w:uiPriority w:val="99"/>
+    <w:unhideWhenUsed/>
+    <w:rsid w:val="00961E37"/>
+    <w:pPr>
+      <w:tabs>
+        <w:tab w:val="center" w:pos="4153"/>
+        <w:tab w:val="right" w:pos="8306"/>
+      </w:tabs>
+      <w:snapToGrid w:val="0"/>
+      <w:spacing w:line="240" w:lineRule="auto"/>
+      <w:jc w:val="center"/>
+    </w:pPr>
+    <w:rPr>
+      <w:sz w:val="18"/>
+      <w:szCs w:val="18"/>
+    </w:rPr>
+  </w:style>
+  <w:style w:type="character" w:customStyle="1" w:styleId="af">
+    <w:name w:val="页眉 字符"/>
+    <w:basedOn w:val="a0"/>
+    <w:link w:val="ae"/>
+    <w:uiPriority w:val="99"/>
+    <w:rsid w:val="00961E37"/>
+    <w:rPr>
+      <w:sz w:val="18"/>
+      <w:szCs w:val="18"/>
+    </w:rPr>
+  </w:style>
+  <w:style w:type="paragraph" w:styleId="af0">
+    <w:name w:val="footer"/>
+    <w:basedOn w:val="a"/>
+    <w:link w:val="af1"/>
+    <w:uiPriority w:val="99"/>
+    <w:unhideWhenUsed/>
+    <w:rsid w:val="00961E37"/>
+    <w:pPr>
+      <w:tabs>
+        <w:tab w:val="center" w:pos="4153"/>
+        <w:tab w:val="right" w:pos="8306"/>
+      </w:tabs>
+      <w:snapToGrid w:val="0"/>
+      <w:spacing w:line="240" w:lineRule="auto"/>
+    </w:pPr>
+    <w:rPr>
+      <w:sz w:val="18"/>
+      <w:szCs w:val="18"/>
+    </w:rPr>
+  </w:style>
+  <w:style w:type="character" w:customStyle="1" w:styleId="af1">
+    <w:name w:val="页脚 字符"/>
+    <w:basedOn w:val="a0"/>
+    <w:link w:val="af0"/>
+    <w:uiPriority w:val="99"/>
+    <w:rsid w:val="00961E37"/>
+    <w:rPr>
+      <w:sz w:val="18"/>
+      <w:szCs w:val="18"/>
+    </w:rPr>
+  </w:style>
+  <w:style w:type="character" w:styleId="af2">
+    <w:name w:val="Hyperlink"/>
+    <w:basedOn w:val="a0"/>
+    <w:uiPriority w:val="99"/>
+    <w:unhideWhenUsed/>
+    <w:rsid w:val="00961E37"/>
+    <w:rPr>
+      <w:color w:val="467886" w:themeColor="hyperlink"/>
+      <w:u w:val="single"/>
+    </w:rPr>
+  </w:style>
 </w:styles>
 </file>
 

</xml_diff>